<commit_message>
docs: 발표 자료에 Cyclone DDS 설정과 pinky_navigation 파라미터 조정 추가
Co-Authored-By: Claude Opus 5.5 <noreply@anthropic.com>
</commit_message>
<xml_diff>
--- a/docs/giddongcar_관제시스템_설계_튜닝.docx
+++ b/docs/giddongcar_관제시스템_설계_튜닝.docx
@@ -607,7 +607,7 @@
           </w:pPr>
           <w:hyperlink w:history="1" w:anchor="_Toc20">
             <w:r>
-              <w:t xml:space="preserve">4.3 교통 정리 파라미터 튜닝</w:t>
+              <w:t xml:space="preserve">4.3 pinky_navigation 기본 조정 (주석에 이전 값 기록)</w:t>
             </w:r>
             <w:r>
               <w:tab/>
@@ -630,7 +630,7 @@
           </w:pPr>
           <w:hyperlink w:history="1" w:anchor="_Toc21">
             <w:r>
-              <w:t xml:space="preserve">4.4 튜닝 근거가 된 관찰</w:t>
+              <w:t xml:space="preserve">4.4 교통 정리 파라미터 튜닝</w:t>
             </w:r>
             <w:r>
               <w:tab/>
@@ -645,14 +645,15 @@
         </w:p>
         <w:p>
           <w:pPr>
-            <w:pStyle w:val="TOC1"/>
+            <w:pStyle w:val="TOC2"/>
             <w:tabs>
               <w:tab w:val="right" w:pos="9638" w:leader="dot"/>
             </w:tabs>
+            <w:ind w:left="220"/>
           </w:pPr>
           <w:hyperlink w:history="1" w:anchor="_Toc22">
             <w:r>
-              <w:t xml:space="preserve">5. 통합·환경 디버깅</w:t>
+              <w:t xml:space="preserve">4.5 튜닝 근거가 된 관찰</w:t>
             </w:r>
             <w:r>
               <w:tab/>
@@ -674,7 +675,7 @@
           </w:pPr>
           <w:hyperlink w:history="1" w:anchor="_Toc23">
             <w:r>
-              <w:t xml:space="preserve">6. 검증 전략</w:t>
+              <w:t xml:space="preserve">5. 통합·환경 디버깅</w:t>
             </w:r>
             <w:r>
               <w:tab/>
@@ -696,7 +697,7 @@
           </w:pPr>
           <w:hyperlink w:history="1" w:anchor="_Toc24">
             <w:r>
-              <w:t xml:space="preserve">7. 한계와 다음 단계</w:t>
+              <w:t xml:space="preserve">6. 검증 전략</w:t>
             </w:r>
             <w:r>
               <w:tab/>
@@ -704,6 +705,28 @@
             <w:r>
               <w:fldChar w:fldCharType="begin" w:dirty="true"/>
               <w:instrText xml:space="preserve">PAGEREF _Toc24 \h</w:instrText>
+              <w:fldChar w:fldCharType="separate"/>
+              <w:fldChar w:fldCharType="end"/>
+            </w:r>
+          </w:hyperlink>
+        </w:p>
+        <w:p>
+          <w:pPr>
+            <w:pStyle w:val="TOC1"/>
+            <w:tabs>
+              <w:tab w:val="right" w:pos="9638" w:leader="dot"/>
+            </w:tabs>
+          </w:pPr>
+          <w:hyperlink w:history="1" w:anchor="_Toc25">
+            <w:r>
+              <w:t xml:space="preserve">7. 한계와 다음 단계</w:t>
+            </w:r>
+            <w:r>
+              <w:tab/>
+            </w:r>
+            <w:r>
+              <w:fldChar w:fldCharType="begin" w:dirty="true"/>
+              <w:instrText xml:space="preserve">PAGEREF _Toc25 \h</w:instrText>
               <w:fldChar w:fldCharType="separate"/>
               <w:fldChar w:fldCharType="end"/>
             </w:r>
@@ -5520,6 +5543,407 @@
     </w:p>
     <w:p>
       <w:pPr>
+        <w:pStyle w:val="Heading3"/>
+      </w:pPr>
+      <w:r>
+        <w:t xml:space="preserve">Cyclone DDS 설정 (실물)</w:t>
+      </w:r>
+    </w:p>
+    <w:p>
+      <w:pPr>
+        <w:spacing w:after="140" w:line="312"/>
+      </w:pPr>
+      <w:r>
+        <w:t xml:space="preserve">실물에서는 </w:t>
+      </w:r>
+      <w:r>
+        <w:rPr>
+          <w:rFonts w:ascii="Consolas" w:cs="Consolas" w:eastAsia="Consolas" w:hAnsi="Consolas"/>
+          <w:color w:val="8A2B2B"/>
+          <w:sz w:val="19"/>
+          <w:szCs w:val="19"/>
+        </w:rPr>
+        <w:t xml:space="preserve">~/.bashrc</w:t>
+      </w:r>
+      <w:r>
+        <w:t xml:space="preserve">에서 </w:t>
+      </w:r>
+      <w:r>
+        <w:rPr>
+          <w:rFonts w:ascii="Consolas" w:cs="Consolas" w:eastAsia="Consolas" w:hAnsi="Consolas"/>
+          <w:color w:val="8A2B2B"/>
+          <w:sz w:val="19"/>
+          <w:szCs w:val="19"/>
+        </w:rPr>
+        <w:t xml:space="preserve">RMW_IMPLEMENTATION=rmw_cyclonedds_cpp</w:t>
+      </w:r>
+      <w:r>
+        <w:t xml:space="preserve">, </w:t>
+      </w:r>
+      <w:r>
+        <w:rPr>
+          <w:rFonts w:ascii="Consolas" w:cs="Consolas" w:eastAsia="Consolas" w:hAnsi="Consolas"/>
+          <w:color w:val="8A2B2B"/>
+          <w:sz w:val="19"/>
+          <w:szCs w:val="19"/>
+        </w:rPr>
+        <w:t xml:space="preserve">CYCLONEDDS_URI=$HOME/.ros/cyclonedds_pc.xml</w:t>
+      </w:r>
+      <w:r>
+        <w:t xml:space="preserve">을 지정한다. 설정 파일의 핵심은 다음과 같다.</w:t>
+      </w:r>
+    </w:p>
+    <w:p>
+      <w:pPr>
+        <w:keepNext/>
+        <w:keepLines/>
+        <w:shd w:fill="F4F5F7" w:color="auto" w:val="clear"/>
+        <w:spacing w:after="0" w:before="100" w:line="255"/>
+        <w:ind w:left="200" w:right="200"/>
+      </w:pPr>
+      <w:r>
+        <w:rPr>
+          <w:rFonts w:ascii="Consolas" w:cs="Consolas" w:eastAsia="Consolas" w:hAnsi="Consolas"/>
+          <w:sz w:val="17"/>
+          <w:szCs w:val="17"/>
+        </w:rPr>
+        <w:t xml:space="preserve">&lt;General&gt;</w:t>
+      </w:r>
+    </w:p>
+    <w:p>
+      <w:pPr>
+        <w:keepNext/>
+        <w:keepLines/>
+        <w:shd w:fill="F4F5F7" w:color="auto" w:val="clear"/>
+        <w:spacing w:after="0" w:before="0" w:line="255"/>
+        <w:ind w:left="200" w:right="200"/>
+      </w:pPr>
+      <w:r>
+        <w:rPr>
+          <w:rFonts w:ascii="Consolas" w:cs="Consolas" w:eastAsia="Consolas" w:hAnsi="Consolas"/>
+          <w:sz w:val="17"/>
+          <w:szCs w:val="17"/>
+        </w:rPr>
+        <w:t xml:space="preserve">  &lt;NetworkInterface name="wlo1" priority="default" multicast="false"/&gt;</w:t>
+      </w:r>
+    </w:p>
+    <w:p>
+      <w:pPr>
+        <w:keepNext/>
+        <w:keepLines/>
+        <w:shd w:fill="F4F5F7" w:color="auto" w:val="clear"/>
+        <w:spacing w:after="0" w:before="0" w:line="255"/>
+        <w:ind w:left="200" w:right="200"/>
+      </w:pPr>
+      <w:r>
+        <w:rPr>
+          <w:rFonts w:ascii="Consolas" w:cs="Consolas" w:eastAsia="Consolas" w:hAnsi="Consolas"/>
+          <w:sz w:val="17"/>
+          <w:szCs w:val="17"/>
+        </w:rPr>
+        <w:t xml:space="preserve">  &lt;AllowMulticast&gt;false&lt;/AllowMulticast&gt;</w:t>
+      </w:r>
+    </w:p>
+    <w:p>
+      <w:pPr>
+        <w:keepNext/>
+        <w:keepLines/>
+        <w:shd w:fill="F4F5F7" w:color="auto" w:val="clear"/>
+        <w:spacing w:after="0" w:before="0" w:line="255"/>
+        <w:ind w:left="200" w:right="200"/>
+      </w:pPr>
+      <w:r>
+        <w:rPr>
+          <w:rFonts w:ascii="Consolas" w:cs="Consolas" w:eastAsia="Consolas" w:hAnsi="Consolas"/>
+          <w:sz w:val="17"/>
+          <w:szCs w:val="17"/>
+        </w:rPr>
+        <w:t xml:space="preserve">&lt;/General&gt;</w:t>
+      </w:r>
+    </w:p>
+    <w:p>
+      <w:pPr>
+        <w:keepNext/>
+        <w:keepLines/>
+        <w:shd w:fill="F4F5F7" w:color="auto" w:val="clear"/>
+        <w:spacing w:after="0" w:before="0" w:line="255"/>
+        <w:ind w:left="200" w:right="200"/>
+      </w:pPr>
+      <w:r>
+        <w:rPr>
+          <w:rFonts w:ascii="Consolas" w:cs="Consolas" w:eastAsia="Consolas" w:hAnsi="Consolas"/>
+          <w:sz w:val="17"/>
+          <w:szCs w:val="17"/>
+        </w:rPr>
+        <w:t xml:space="preserve">&lt;Discovery&gt;</w:t>
+      </w:r>
+    </w:p>
+    <w:p>
+      <w:pPr>
+        <w:keepNext/>
+        <w:keepLines/>
+        <w:shd w:fill="F4F5F7" w:color="auto" w:val="clear"/>
+        <w:spacing w:after="0" w:before="0" w:line="255"/>
+        <w:ind w:left="200" w:right="200"/>
+      </w:pPr>
+      <w:r>
+        <w:rPr>
+          <w:rFonts w:ascii="Consolas" w:cs="Consolas" w:eastAsia="Consolas" w:hAnsi="Consolas"/>
+          <w:sz w:val="17"/>
+          <w:szCs w:val="17"/>
+        </w:rPr>
+        <w:t xml:space="preserve">  &lt;ParticipantIndex&gt;auto&lt;/ParticipantIndex&gt;</w:t>
+      </w:r>
+    </w:p>
+    <w:p>
+      <w:pPr>
+        <w:keepNext/>
+        <w:keepLines/>
+        <w:shd w:fill="F4F5F7" w:color="auto" w:val="clear"/>
+        <w:spacing w:after="0" w:before="0" w:line="255"/>
+        <w:ind w:left="200" w:right="200"/>
+      </w:pPr>
+      <w:r>
+        <w:rPr>
+          <w:rFonts w:ascii="Consolas" w:cs="Consolas" w:eastAsia="Consolas" w:hAnsi="Consolas"/>
+          <w:sz w:val="17"/>
+          <w:szCs w:val="17"/>
+        </w:rPr>
+        <w:t xml:space="preserve">  &lt;MaxAutoParticipantIndex&gt;50&lt;/MaxAutoParticipantIndex&gt;</w:t>
+      </w:r>
+    </w:p>
+    <w:p>
+      <w:pPr>
+        <w:keepNext/>
+        <w:keepLines/>
+        <w:shd w:fill="F4F5F7" w:color="auto" w:val="clear"/>
+        <w:spacing w:after="0" w:before="0" w:line="255"/>
+        <w:ind w:left="200" w:right="200"/>
+      </w:pPr>
+      <w:r>
+        <w:rPr>
+          <w:rFonts w:ascii="Consolas" w:cs="Consolas" w:eastAsia="Consolas" w:hAnsi="Consolas"/>
+          <w:sz w:val="17"/>
+          <w:szCs w:val="17"/>
+        </w:rPr>
+        <w:t xml:space="preserve">  &lt;Peers&gt;</w:t>
+      </w:r>
+    </w:p>
+    <w:p>
+      <w:pPr>
+        <w:keepNext/>
+        <w:keepLines/>
+        <w:shd w:fill="F4F5F7" w:color="auto" w:val="clear"/>
+        <w:spacing w:after="0" w:before="0" w:line="255"/>
+        <w:ind w:left="200" w:right="200"/>
+      </w:pPr>
+      <w:r>
+        <w:rPr>
+          <w:rFonts w:ascii="Consolas" w:cs="Consolas" w:eastAsia="Consolas" w:hAnsi="Consolas"/>
+          <w:sz w:val="17"/>
+          <w:szCs w:val="17"/>
+        </w:rPr>
+        <w:t xml:space="preserve">    &lt;Peer Address="192.168.0.6"/&gt;   &lt;!-- robot1 --&gt;</w:t>
+      </w:r>
+    </w:p>
+    <w:p>
+      <w:pPr>
+        <w:keepNext/>
+        <w:keepLines/>
+        <w:shd w:fill="F4F5F7" w:color="auto" w:val="clear"/>
+        <w:spacing w:after="0" w:before="0" w:line="255"/>
+        <w:ind w:left="200" w:right="200"/>
+      </w:pPr>
+      <w:r>
+        <w:rPr>
+          <w:rFonts w:ascii="Consolas" w:cs="Consolas" w:eastAsia="Consolas" w:hAnsi="Consolas"/>
+          <w:sz w:val="17"/>
+          <w:szCs w:val="17"/>
+        </w:rPr>
+        <w:t xml:space="preserve">    &lt;Peer Address="192.168.0.8"/&gt;   &lt;!-- robot2 --&gt;</w:t>
+      </w:r>
+    </w:p>
+    <w:p>
+      <w:pPr>
+        <w:keepNext/>
+        <w:keepLines/>
+        <w:shd w:fill="F4F5F7" w:color="auto" w:val="clear"/>
+        <w:spacing w:after="0" w:before="0" w:line="255"/>
+        <w:ind w:left="200" w:right="200"/>
+      </w:pPr>
+      <w:r>
+        <w:rPr>
+          <w:rFonts w:ascii="Consolas" w:cs="Consolas" w:eastAsia="Consolas" w:hAnsi="Consolas"/>
+          <w:sz w:val="17"/>
+          <w:szCs w:val="17"/>
+        </w:rPr>
+        <w:t xml:space="preserve">    &lt;Peer Address="192.168.0.4"/&gt;   &lt;!-- 관제 PC --&gt;</w:t>
+      </w:r>
+    </w:p>
+    <w:p>
+      <w:pPr>
+        <w:keepNext/>
+        <w:keepLines/>
+        <w:shd w:fill="F4F5F7" w:color="auto" w:val="clear"/>
+        <w:spacing w:after="0" w:before="0" w:line="255"/>
+        <w:ind w:left="200" w:right="200"/>
+      </w:pPr>
+      <w:r>
+        <w:rPr>
+          <w:rFonts w:ascii="Consolas" w:cs="Consolas" w:eastAsia="Consolas" w:hAnsi="Consolas"/>
+          <w:sz w:val="17"/>
+          <w:szCs w:val="17"/>
+        </w:rPr>
+        <w:t xml:space="preserve">  &lt;/Peers&gt;</w:t>
+      </w:r>
+    </w:p>
+    <w:p>
+      <w:pPr>
+        <w:keepNext w:val="false"/>
+        <w:keepLines/>
+        <w:shd w:fill="F4F5F7" w:color="auto" w:val="clear"/>
+        <w:spacing w:after="180" w:before="0" w:line="255"/>
+        <w:ind w:left="200" w:right="200"/>
+      </w:pPr>
+      <w:r>
+        <w:rPr>
+          <w:rFonts w:ascii="Consolas" w:cs="Consolas" w:eastAsia="Consolas" w:hAnsi="Consolas"/>
+          <w:sz w:val="17"/>
+          <w:szCs w:val="17"/>
+        </w:rPr>
+        <w:t xml:space="preserve">&lt;/Discovery&gt;</w:t>
+      </w:r>
+    </w:p>
+    <w:p>
+      <w:pPr>
+        <w:pStyle w:val="ListParagraph"/>
+        <w:numPr>
+          <w:ilvl w:val="0"/>
+          <w:numId w:val="2"/>
+        </w:numPr>
+        <w:spacing w:after="70" w:line="300"/>
+      </w:pPr>
+      <w:r>
+        <w:rPr>
+          <w:b/>
+          <w:bCs/>
+        </w:rPr>
+        <w:t xml:space="preserve">멀티캐스트 끄고 peer 명시:</w:t>
+      </w:r>
+      <w:r>
+        <w:t xml:space="preserve"> AP가 SPDP 멀티캐스트를 차단하므로 로봇 2대와 관제 PC를 유니캐스트 peer로 직접 적는다.</w:t>
+      </w:r>
+    </w:p>
+    <w:p>
+      <w:pPr>
+        <w:pStyle w:val="ListParagraph"/>
+        <w:numPr>
+          <w:ilvl w:val="0"/>
+          <w:numId w:val="2"/>
+        </w:numPr>
+        <w:spacing w:after="70" w:line="300"/>
+      </w:pPr>
+      <w:r>
+        <w:rPr>
+          <w:b/>
+          <w:bCs/>
+        </w:rPr>
+        <w:t xml:space="preserve">MaxAutoParticipantIndex 50:</w:t>
+      </w:r>
+      <w:r>
+        <w:t xml:space="preserve"> 유니캐스트 모드에서는 PC·도메인당 참가자 수 상한이 기본 약 10개다. Nav2 스택, 대시보드, ros2 CLI가 겹치면 모자라서 올렸다.</w:t>
+      </w:r>
+    </w:p>
+    <w:p>
+      <w:pPr>
+        <w:pStyle w:val="ListParagraph"/>
+        <w:numPr>
+          <w:ilvl w:val="0"/>
+          <w:numId w:val="2"/>
+        </w:numPr>
+        <w:spacing w:after="70" w:line="300"/>
+      </w:pPr>
+      <w:r>
+        <w:rPr>
+          <w:b/>
+          <w:bCs/>
+        </w:rPr>
+        <w:t xml:space="preserve">PC와 로봇이 같은 RMW:</w:t>
+      </w:r>
+      <w:r>
+        <w:t xml:space="preserve"> 로봇 bringup도 Cyclone DDS여야 한다. 섞이면 </w:t>
+      </w:r>
+      <w:r>
+        <w:rPr>
+          <w:rFonts w:ascii="Consolas" w:cs="Consolas" w:eastAsia="Consolas" w:hAnsi="Consolas"/>
+          <w:color w:val="8A2B2B"/>
+          <w:sz w:val="19"/>
+          <w:szCs w:val="19"/>
+        </w:rPr>
+        <w:t xml:space="preserve">/odom</w:t>
+      </w:r>
+      <w:r>
+        <w:t xml:space="preserve">·TF가 PC에 오지 않는다.</w:t>
+      </w:r>
+    </w:p>
+    <w:p>
+      <w:pPr>
+        <w:pStyle w:val="ListParagraph"/>
+        <w:numPr>
+          <w:ilvl w:val="0"/>
+          <w:numId w:val="2"/>
+        </w:numPr>
+        <w:spacing w:after="70" w:line="300"/>
+      </w:pPr>
+      <w:r>
+        <w:rPr>
+          <w:b/>
+          <w:bCs/>
+        </w:rPr>
+        <w:t xml:space="preserve">시뮬은 반대로:</w:t>
+      </w:r>
+      <w:r>
+        <w:t xml:space="preserve"> </w:t>
+      </w:r>
+      <w:r>
+        <w:rPr>
+          <w:rFonts w:ascii="Consolas" w:cs="Consolas" w:eastAsia="Consolas" w:hAnsi="Consolas"/>
+          <w:color w:val="8A2B2B"/>
+          <w:sz w:val="19"/>
+          <w:szCs w:val="19"/>
+        </w:rPr>
+        <w:t xml:space="preserve">sim.launch.py</w:t>
+      </w:r>
+      <w:r>
+        <w:t xml:space="preserve">가 Fast DDS + </w:t>
+      </w:r>
+      <w:r>
+        <w:rPr>
+          <w:rFonts w:ascii="Consolas" w:cs="Consolas" w:eastAsia="Consolas" w:hAnsi="Consolas"/>
+          <w:color w:val="8A2B2B"/>
+          <w:sz w:val="19"/>
+          <w:szCs w:val="19"/>
+        </w:rPr>
+        <w:t xml:space="preserve">LOCALHOST</w:t>
+      </w:r>
+      <w:r>
+        <w:t xml:space="preserve">로 바꾸고 </w:t>
+      </w:r>
+      <w:r>
+        <w:rPr>
+          <w:rFonts w:ascii="Consolas" w:cs="Consolas" w:eastAsia="Consolas" w:hAnsi="Consolas"/>
+          <w:color w:val="8A2B2B"/>
+          <w:sz w:val="19"/>
+          <w:szCs w:val="19"/>
+        </w:rPr>
+        <w:t xml:space="preserve">CYCLONEDDS_URI</w:t>
+      </w:r>
+      <w:r>
+        <w:t xml:space="preserve">·peer 변수를 지운다.</w:t>
+      </w:r>
+    </w:p>
+    <w:p>
+      <w:pPr>
         <w:pBdr>
           <w:left w:val="single" w:color="C98A2B" w:sz="18" w:space="8"/>
         </w:pBdr>
@@ -10283,9 +10707,1038 @@
       </w:pPr>
       <w:bookmarkStart w:name="_Toc20" w:id="20"/>
       <w:r>
-        <w:t xml:space="preserve">4.3 교통 정리 파라미터 튜닝</w:t>
+        <w:t xml:space="preserve">4.3 pinky_navigation 기본 조정 (주석에 이전 값 기록)</w:t>
       </w:r>
       <w:bookmarkEnd w:id="20"/>
+    </w:p>
+    <w:p>
+      <w:pPr>
+        <w:spacing w:after="140" w:line="312"/>
+      </w:pPr>
+      <w:r>
+        <w:t xml:space="preserve">팀용 복사본의 5개와 별개로, </w:t>
+      </w:r>
+      <w:r>
+        <w:rPr>
+          <w:rFonts w:ascii="Consolas" w:cs="Consolas" w:eastAsia="Consolas" w:hAnsi="Consolas"/>
+          <w:color w:val="8A2B2B"/>
+          <w:sz w:val="19"/>
+          <w:szCs w:val="19"/>
+        </w:rPr>
+        <w:t xml:space="preserve">pinky_navigation/params/nav2_params.yaml</w:t>
+      </w:r>
+      <w:r>
+        <w:t xml:space="preserve">에는 작은 로봇과 좁은 방에 맞춘 조정이 이미 들어 있다. 각 줄 주석(</w:t>
+      </w:r>
+      <w:r>
+        <w:rPr>
+          <w:rFonts w:ascii="Consolas" w:cs="Consolas" w:eastAsia="Consolas" w:hAnsi="Consolas"/>
+          <w:color w:val="8A2B2B"/>
+          <w:sz w:val="19"/>
+          <w:szCs w:val="19"/>
+        </w:rPr>
+        <w:t xml:space="preserve"># ham</w:t>
+      </w:r>
+      <w:r>
+        <w:t xml:space="preserve">)에 이전 값이 남아 있고, 팀용 복사본도 이 값을 그대로 이어받는다.</w:t>
+      </w:r>
+    </w:p>
+    <w:tbl>
+      <w:tblPr>
+        <w:tblW w:type="dxa" w:w="9638"/>
+        <w:tblBorders>
+          <w:top w:val="single" w:color="auto" w:sz="4"/>
+          <w:left w:val="single" w:color="auto" w:sz="4"/>
+          <w:bottom w:val="single" w:color="auto" w:sz="4"/>
+          <w:right w:val="single" w:color="auto" w:sz="4"/>
+          <w:insideH w:val="single" w:color="auto" w:sz="4"/>
+          <w:insideV w:val="single" w:color="auto" w:sz="4"/>
+        </w:tblBorders>
+      </w:tblPr>
+      <w:tblGrid>
+        <w:gridCol w:w="3200"/>
+        <w:gridCol w:w="1300"/>
+        <w:gridCol w:w="1300"/>
+        <w:gridCol w:w="3838"/>
+      </w:tblGrid>
+      <w:tr>
+        <w:trPr>
+          <w:cantSplit/>
+          <w:tblHeader/>
+        </w:trPr>
+        <w:tc>
+          <w:tcPr>
+            <w:tcW w:type="dxa" w:w="3200"/>
+            <w:tcBorders>
+              <w:top w:val="single" w:color="BFC7D3" w:sz="4"/>
+              <w:left w:val="single" w:color="BFC7D3" w:sz="4"/>
+              <w:bottom w:val="single" w:color="BFC7D3" w:sz="4"/>
+              <w:right w:val="single" w:color="BFC7D3" w:sz="4"/>
+            </w:tcBorders>
+            <w:shd w:fill="1F3B63" w:color="auto" w:val="clear"/>
+            <w:tcMar>
+              <w:top w:type="dxa" w:w="60"/>
+              <w:left w:type="dxa" w:w="100"/>
+              <w:bottom w:type="dxa" w:w="60"/>
+              <w:right w:type="dxa" w:w="100"/>
+            </w:tcMar>
+          </w:tcPr>
+          <w:p>
+            <w:pPr>
+              <w:spacing w:after="0" w:line="265"/>
+            </w:pPr>
+            <w:r>
+              <w:rPr>
+                <w:b/>
+                <w:bCs/>
+                <w:color w:val="FFFFFF"/>
+                <w:sz w:val="18"/>
+                <w:szCs w:val="18"/>
+              </w:rPr>
+              <w:t xml:space="preserve">파라미터</w:t>
+            </w:r>
+          </w:p>
+        </w:tc>
+        <w:tc>
+          <w:tcPr>
+            <w:tcW w:type="dxa" w:w="1300"/>
+            <w:tcBorders>
+              <w:top w:val="single" w:color="BFC7D3" w:sz="4"/>
+              <w:left w:val="single" w:color="BFC7D3" w:sz="4"/>
+              <w:bottom w:val="single" w:color="BFC7D3" w:sz="4"/>
+              <w:right w:val="single" w:color="BFC7D3" w:sz="4"/>
+            </w:tcBorders>
+            <w:shd w:fill="1F3B63" w:color="auto" w:val="clear"/>
+            <w:tcMar>
+              <w:top w:type="dxa" w:w="60"/>
+              <w:left w:type="dxa" w:w="100"/>
+              <w:bottom w:type="dxa" w:w="60"/>
+              <w:right w:type="dxa" w:w="100"/>
+            </w:tcMar>
+          </w:tcPr>
+          <w:p>
+            <w:pPr>
+              <w:spacing w:after="0" w:line="265"/>
+            </w:pPr>
+            <w:r>
+              <w:rPr>
+                <w:b/>
+                <w:bCs/>
+                <w:color w:val="FFFFFF"/>
+                <w:sz w:val="18"/>
+                <w:szCs w:val="18"/>
+              </w:rPr>
+              <w:t xml:space="preserve">이전</w:t>
+            </w:r>
+          </w:p>
+        </w:tc>
+        <w:tc>
+          <w:tcPr>
+            <w:tcW w:type="dxa" w:w="1300"/>
+            <w:tcBorders>
+              <w:top w:val="single" w:color="BFC7D3" w:sz="4"/>
+              <w:left w:val="single" w:color="BFC7D3" w:sz="4"/>
+              <w:bottom w:val="single" w:color="BFC7D3" w:sz="4"/>
+              <w:right w:val="single" w:color="BFC7D3" w:sz="4"/>
+            </w:tcBorders>
+            <w:shd w:fill="1F3B63" w:color="auto" w:val="clear"/>
+            <w:tcMar>
+              <w:top w:type="dxa" w:w="60"/>
+              <w:left w:type="dxa" w:w="100"/>
+              <w:bottom w:type="dxa" w:w="60"/>
+              <w:right w:type="dxa" w:w="100"/>
+            </w:tcMar>
+          </w:tcPr>
+          <w:p>
+            <w:pPr>
+              <w:spacing w:after="0" w:line="265"/>
+            </w:pPr>
+            <w:r>
+              <w:rPr>
+                <w:b/>
+                <w:bCs/>
+                <w:color w:val="FFFFFF"/>
+                <w:sz w:val="18"/>
+                <w:szCs w:val="18"/>
+              </w:rPr>
+              <w:t xml:space="preserve">적용</w:t>
+            </w:r>
+          </w:p>
+        </w:tc>
+        <w:tc>
+          <w:tcPr>
+            <w:tcW w:type="dxa" w:w="3838"/>
+            <w:tcBorders>
+              <w:top w:val="single" w:color="BFC7D3" w:sz="4"/>
+              <w:left w:val="single" w:color="BFC7D3" w:sz="4"/>
+              <w:bottom w:val="single" w:color="BFC7D3" w:sz="4"/>
+              <w:right w:val="single" w:color="BFC7D3" w:sz="4"/>
+            </w:tcBorders>
+            <w:shd w:fill="1F3B63" w:color="auto" w:val="clear"/>
+            <w:tcMar>
+              <w:top w:type="dxa" w:w="60"/>
+              <w:left w:type="dxa" w:w="100"/>
+              <w:bottom w:type="dxa" w:w="60"/>
+              <w:right w:type="dxa" w:w="100"/>
+            </w:tcMar>
+          </w:tcPr>
+          <w:p>
+            <w:pPr>
+              <w:spacing w:after="0" w:line="265"/>
+            </w:pPr>
+            <w:r>
+              <w:rPr>
+                <w:b/>
+                <w:bCs/>
+                <w:color w:val="FFFFFF"/>
+                <w:sz w:val="18"/>
+                <w:szCs w:val="18"/>
+              </w:rPr>
+              <w:t xml:space="preserve">의도</w:t>
+            </w:r>
+          </w:p>
+        </w:tc>
+      </w:tr>
+      <w:tr>
+        <w:trPr>
+          <w:cantSplit/>
+        </w:trPr>
+        <w:tc>
+          <w:tcPr>
+            <w:tcW w:type="dxa" w:w="3200"/>
+            <w:tcBorders>
+              <w:top w:val="single" w:color="BFC7D3" w:sz="4"/>
+              <w:left w:val="single" w:color="BFC7D3" w:sz="4"/>
+              <w:bottom w:val="single" w:color="BFC7D3" w:sz="4"/>
+              <w:right w:val="single" w:color="BFC7D3" w:sz="4"/>
+            </w:tcBorders>
+            <w:shd w:fill="F3F6FA" w:color="auto" w:val="clear"/>
+            <w:tcMar>
+              <w:top w:type="dxa" w:w="60"/>
+              <w:left w:type="dxa" w:w="100"/>
+              <w:bottom w:type="dxa" w:w="60"/>
+              <w:right w:type="dxa" w:w="100"/>
+            </w:tcMar>
+          </w:tcPr>
+          <w:p>
+            <w:pPr>
+              <w:spacing w:after="0" w:line="265"/>
+            </w:pPr>
+            <w:r>
+              <w:rPr>
+                <w:sz w:val="18"/>
+                <w:szCs w:val="18"/>
+              </w:rPr>
+              <w:t xml:space="preserve">AMCL </w:t>
+            </w:r>
+            <w:r>
+              <w:rPr>
+                <w:rFonts w:ascii="Consolas" w:cs="Consolas" w:eastAsia="Consolas" w:hAnsi="Consolas"/>
+                <w:color w:val="8A2B2B"/>
+                <w:sz w:val="16"/>
+                <w:szCs w:val="16"/>
+              </w:rPr>
+              <w:t xml:space="preserve">update_min_d</w:t>
+            </w:r>
+            <w:r>
+              <w:rPr>
+                <w:sz w:val="18"/>
+                <w:szCs w:val="18"/>
+              </w:rPr>
+              <w:t xml:space="preserve"> / </w:t>
+            </w:r>
+            <w:r>
+              <w:rPr>
+                <w:rFonts w:ascii="Consolas" w:cs="Consolas" w:eastAsia="Consolas" w:hAnsi="Consolas"/>
+                <w:color w:val="8A2B2B"/>
+                <w:sz w:val="16"/>
+                <w:szCs w:val="16"/>
+              </w:rPr>
+              <w:t xml:space="preserve">update_min_a</w:t>
+            </w:r>
+          </w:p>
+        </w:tc>
+        <w:tc>
+          <w:tcPr>
+            <w:tcW w:type="dxa" w:w="1300"/>
+            <w:tcBorders>
+              <w:top w:val="single" w:color="BFC7D3" w:sz="4"/>
+              <w:left w:val="single" w:color="BFC7D3" w:sz="4"/>
+              <w:bottom w:val="single" w:color="BFC7D3" w:sz="4"/>
+              <w:right w:val="single" w:color="BFC7D3" w:sz="4"/>
+            </w:tcBorders>
+            <w:tcMar>
+              <w:top w:type="dxa" w:w="60"/>
+              <w:left w:type="dxa" w:w="100"/>
+              <w:bottom w:type="dxa" w:w="60"/>
+              <w:right w:type="dxa" w:w="100"/>
+            </w:tcMar>
+          </w:tcPr>
+          <w:p>
+            <w:pPr>
+              <w:spacing w:after="0" w:line="265"/>
+            </w:pPr>
+            <w:r>
+              <w:rPr>
+                <w:sz w:val="18"/>
+                <w:szCs w:val="18"/>
+              </w:rPr>
+              <w:t xml:space="preserve">0.15 m / 0.1</w:t>
+            </w:r>
+          </w:p>
+        </w:tc>
+        <w:tc>
+          <w:tcPr>
+            <w:tcW w:type="dxa" w:w="1300"/>
+            <w:tcBorders>
+              <w:top w:val="single" w:color="BFC7D3" w:sz="4"/>
+              <w:left w:val="single" w:color="BFC7D3" w:sz="4"/>
+              <w:bottom w:val="single" w:color="BFC7D3" w:sz="4"/>
+              <w:right w:val="single" w:color="BFC7D3" w:sz="4"/>
+            </w:tcBorders>
+            <w:tcMar>
+              <w:top w:type="dxa" w:w="60"/>
+              <w:left w:type="dxa" w:w="100"/>
+              <w:bottom w:type="dxa" w:w="60"/>
+              <w:right w:type="dxa" w:w="100"/>
+            </w:tcMar>
+          </w:tcPr>
+          <w:p>
+            <w:pPr>
+              <w:spacing w:after="0" w:line="265"/>
+            </w:pPr>
+            <w:r>
+              <w:rPr>
+                <w:sz w:val="18"/>
+                <w:szCs w:val="18"/>
+              </w:rPr>
+              <w:t xml:space="preserve">0.01 m / 0.01</w:t>
+            </w:r>
+          </w:p>
+        </w:tc>
+        <w:tc>
+          <w:tcPr>
+            <w:tcW w:type="dxa" w:w="3838"/>
+            <w:tcBorders>
+              <w:top w:val="single" w:color="BFC7D3" w:sz="4"/>
+              <w:left w:val="single" w:color="BFC7D3" w:sz="4"/>
+              <w:bottom w:val="single" w:color="BFC7D3" w:sz="4"/>
+              <w:right w:val="single" w:color="BFC7D3" w:sz="4"/>
+            </w:tcBorders>
+            <w:tcMar>
+              <w:top w:type="dxa" w:w="60"/>
+              <w:left w:type="dxa" w:w="100"/>
+              <w:bottom w:type="dxa" w:w="60"/>
+              <w:right w:type="dxa" w:w="100"/>
+            </w:tcMar>
+          </w:tcPr>
+          <w:p>
+            <w:pPr>
+              <w:spacing w:after="0" w:line="265"/>
+            </w:pPr>
+            <w:r>
+              <w:rPr>
+                <w:sz w:val="18"/>
+                <w:szCs w:val="18"/>
+              </w:rPr>
+              <w:t xml:space="preserve">1 cm만 움직여도 위치 갱신</w:t>
+            </w:r>
+          </w:p>
+        </w:tc>
+      </w:tr>
+      <w:tr>
+        <w:trPr>
+          <w:cantSplit/>
+        </w:trPr>
+        <w:tc>
+          <w:tcPr>
+            <w:tcW w:type="dxa" w:w="3200"/>
+            <w:tcBorders>
+              <w:top w:val="single" w:color="BFC7D3" w:sz="4"/>
+              <w:left w:val="single" w:color="BFC7D3" w:sz="4"/>
+              <w:bottom w:val="single" w:color="BFC7D3" w:sz="4"/>
+              <w:right w:val="single" w:color="BFC7D3" w:sz="4"/>
+            </w:tcBorders>
+            <w:shd w:fill="F3F6FA" w:color="auto" w:val="clear"/>
+            <w:tcMar>
+              <w:top w:type="dxa" w:w="60"/>
+              <w:left w:type="dxa" w:w="100"/>
+              <w:bottom w:type="dxa" w:w="60"/>
+              <w:right w:type="dxa" w:w="100"/>
+            </w:tcMar>
+          </w:tcPr>
+          <w:p>
+            <w:pPr>
+              <w:spacing w:after="0" w:line="265"/>
+            </w:pPr>
+            <w:r>
+              <w:rPr>
+                <w:sz w:val="18"/>
+                <w:szCs w:val="18"/>
+              </w:rPr>
+              <w:t xml:space="preserve">RPP </w:t>
+            </w:r>
+            <w:r>
+              <w:rPr>
+                <w:rFonts w:ascii="Consolas" w:cs="Consolas" w:eastAsia="Consolas" w:hAnsi="Consolas"/>
+                <w:color w:val="8A2B2B"/>
+                <w:sz w:val="16"/>
+                <w:szCs w:val="16"/>
+              </w:rPr>
+              <w:t xml:space="preserve">lookahead_dist</w:t>
+            </w:r>
+          </w:p>
+        </w:tc>
+        <w:tc>
+          <w:tcPr>
+            <w:tcW w:type="dxa" w:w="1300"/>
+            <w:tcBorders>
+              <w:top w:val="single" w:color="BFC7D3" w:sz="4"/>
+              <w:left w:val="single" w:color="BFC7D3" w:sz="4"/>
+              <w:bottom w:val="single" w:color="BFC7D3" w:sz="4"/>
+              <w:right w:val="single" w:color="BFC7D3" w:sz="4"/>
+            </w:tcBorders>
+            <w:tcMar>
+              <w:top w:type="dxa" w:w="60"/>
+              <w:left w:type="dxa" w:w="100"/>
+              <w:bottom w:type="dxa" w:w="60"/>
+              <w:right w:type="dxa" w:w="100"/>
+            </w:tcMar>
+          </w:tcPr>
+          <w:p>
+            <w:pPr>
+              <w:spacing w:after="0" w:line="265"/>
+            </w:pPr>
+            <w:r>
+              <w:rPr>
+                <w:sz w:val="18"/>
+                <w:szCs w:val="18"/>
+              </w:rPr>
+              <w:t xml:space="preserve">0.6 m</w:t>
+            </w:r>
+          </w:p>
+        </w:tc>
+        <w:tc>
+          <w:tcPr>
+            <w:tcW w:type="dxa" w:w="1300"/>
+            <w:tcBorders>
+              <w:top w:val="single" w:color="BFC7D3" w:sz="4"/>
+              <w:left w:val="single" w:color="BFC7D3" w:sz="4"/>
+              <w:bottom w:val="single" w:color="BFC7D3" w:sz="4"/>
+              <w:right w:val="single" w:color="BFC7D3" w:sz="4"/>
+            </w:tcBorders>
+            <w:tcMar>
+              <w:top w:type="dxa" w:w="60"/>
+              <w:left w:type="dxa" w:w="100"/>
+              <w:bottom w:type="dxa" w:w="60"/>
+              <w:right w:type="dxa" w:w="100"/>
+            </w:tcMar>
+          </w:tcPr>
+          <w:p>
+            <w:pPr>
+              <w:spacing w:after="0" w:line="265"/>
+            </w:pPr>
+            <w:r>
+              <w:rPr>
+                <w:sz w:val="18"/>
+                <w:szCs w:val="18"/>
+              </w:rPr>
+              <w:t xml:space="preserve">0.05 m</w:t>
+            </w:r>
+          </w:p>
+        </w:tc>
+        <w:tc>
+          <w:tcPr>
+            <w:tcW w:type="dxa" w:w="3838"/>
+            <w:tcBorders>
+              <w:top w:val="single" w:color="BFC7D3" w:sz="4"/>
+              <w:left w:val="single" w:color="BFC7D3" w:sz="4"/>
+              <w:bottom w:val="single" w:color="BFC7D3" w:sz="4"/>
+              <w:right w:val="single" w:color="BFC7D3" w:sz="4"/>
+            </w:tcBorders>
+            <w:tcMar>
+              <w:top w:type="dxa" w:w="60"/>
+              <w:left w:type="dxa" w:w="100"/>
+              <w:bottom w:type="dxa" w:w="60"/>
+              <w:right w:type="dxa" w:w="100"/>
+            </w:tcMar>
+          </w:tcPr>
+          <w:p>
+            <w:pPr>
+              <w:spacing w:after="0" w:line="265"/>
+            </w:pPr>
+            <w:r>
+              <w:rPr>
+                <w:sz w:val="18"/>
+                <w:szCs w:val="18"/>
+              </w:rPr>
+              <w:t xml:space="preserve">실제는 속도 비례 lookahead로 0.15~0.9 m에 제한됨</w:t>
+            </w:r>
+          </w:p>
+        </w:tc>
+      </w:tr>
+      <w:tr>
+        <w:trPr>
+          <w:cantSplit/>
+        </w:trPr>
+        <w:tc>
+          <w:tcPr>
+            <w:tcW w:type="dxa" w:w="3200"/>
+            <w:tcBorders>
+              <w:top w:val="single" w:color="BFC7D3" w:sz="4"/>
+              <w:left w:val="single" w:color="BFC7D3" w:sz="4"/>
+              <w:bottom w:val="single" w:color="BFC7D3" w:sz="4"/>
+              <w:right w:val="single" w:color="BFC7D3" w:sz="4"/>
+            </w:tcBorders>
+            <w:shd w:fill="F3F6FA" w:color="auto" w:val="clear"/>
+            <w:tcMar>
+              <w:top w:type="dxa" w:w="60"/>
+              <w:left w:type="dxa" w:w="100"/>
+              <w:bottom w:type="dxa" w:w="60"/>
+              <w:right w:type="dxa" w:w="100"/>
+            </w:tcMar>
+          </w:tcPr>
+          <w:p>
+            <w:pPr>
+              <w:spacing w:after="0" w:line="265"/>
+            </w:pPr>
+            <w:r>
+              <w:rPr>
+                <w:sz w:val="18"/>
+                <w:szCs w:val="18"/>
+              </w:rPr>
+              <w:t xml:space="preserve">costmap </w:t>
+            </w:r>
+            <w:r>
+              <w:rPr>
+                <w:rFonts w:ascii="Consolas" w:cs="Consolas" w:eastAsia="Consolas" w:hAnsi="Consolas"/>
+                <w:color w:val="8A2B2B"/>
+                <w:sz w:val="16"/>
+                <w:szCs w:val="16"/>
+              </w:rPr>
+              <w:t xml:space="preserve">resolution</w:t>
+            </w:r>
+            <w:r>
+              <w:rPr>
+                <w:sz w:val="18"/>
+                <w:szCs w:val="18"/>
+              </w:rPr>
+              <w:t xml:space="preserve"> (local / global)</w:t>
+            </w:r>
+          </w:p>
+        </w:tc>
+        <w:tc>
+          <w:tcPr>
+            <w:tcW w:type="dxa" w:w="1300"/>
+            <w:tcBorders>
+              <w:top w:val="single" w:color="BFC7D3" w:sz="4"/>
+              <w:left w:val="single" w:color="BFC7D3" w:sz="4"/>
+              <w:bottom w:val="single" w:color="BFC7D3" w:sz="4"/>
+              <w:right w:val="single" w:color="BFC7D3" w:sz="4"/>
+            </w:tcBorders>
+            <w:tcMar>
+              <w:top w:type="dxa" w:w="60"/>
+              <w:left w:type="dxa" w:w="100"/>
+              <w:bottom w:type="dxa" w:w="60"/>
+              <w:right w:type="dxa" w:w="100"/>
+            </w:tcMar>
+          </w:tcPr>
+          <w:p>
+            <w:pPr>
+              <w:spacing w:after="0" w:line="265"/>
+            </w:pPr>
+            <w:r>
+              <w:rPr>
+                <w:sz w:val="18"/>
+                <w:szCs w:val="18"/>
+              </w:rPr>
+              <w:t xml:space="preserve">0.05 m</w:t>
+            </w:r>
+          </w:p>
+        </w:tc>
+        <w:tc>
+          <w:tcPr>
+            <w:tcW w:type="dxa" w:w="1300"/>
+            <w:tcBorders>
+              <w:top w:val="single" w:color="BFC7D3" w:sz="4"/>
+              <w:left w:val="single" w:color="BFC7D3" w:sz="4"/>
+              <w:bottom w:val="single" w:color="BFC7D3" w:sz="4"/>
+              <w:right w:val="single" w:color="BFC7D3" w:sz="4"/>
+            </w:tcBorders>
+            <w:tcMar>
+              <w:top w:type="dxa" w:w="60"/>
+              <w:left w:type="dxa" w:w="100"/>
+              <w:bottom w:type="dxa" w:w="60"/>
+              <w:right w:type="dxa" w:w="100"/>
+            </w:tcMar>
+          </w:tcPr>
+          <w:p>
+            <w:pPr>
+              <w:spacing w:after="0" w:line="265"/>
+            </w:pPr>
+            <w:r>
+              <w:rPr>
+                <w:sz w:val="18"/>
+                <w:szCs w:val="18"/>
+              </w:rPr>
+              <w:t xml:space="preserve">0.01 m</w:t>
+            </w:r>
+          </w:p>
+        </w:tc>
+        <w:tc>
+          <w:tcPr>
+            <w:tcW w:type="dxa" w:w="3838"/>
+            <w:tcBorders>
+              <w:top w:val="single" w:color="BFC7D3" w:sz="4"/>
+              <w:left w:val="single" w:color="BFC7D3" w:sz="4"/>
+              <w:bottom w:val="single" w:color="BFC7D3" w:sz="4"/>
+              <w:right w:val="single" w:color="BFC7D3" w:sz="4"/>
+            </w:tcBorders>
+            <w:tcMar>
+              <w:top w:type="dxa" w:w="60"/>
+              <w:left w:type="dxa" w:w="100"/>
+              <w:bottom w:type="dxa" w:w="60"/>
+              <w:right w:type="dxa" w:w="100"/>
+            </w:tcMar>
+          </w:tcPr>
+          <w:p>
+            <w:pPr>
+              <w:spacing w:after="0" w:line="265"/>
+            </w:pPr>
+            <w:r>
+              <w:rPr>
+                <w:sz w:val="18"/>
+                <w:szCs w:val="18"/>
+              </w:rPr>
+              <w:t xml:space="preserve">12 × 10 cm 로봇과 35 cm 문을 격자로 표현</w:t>
+            </w:r>
+          </w:p>
+        </w:tc>
+      </w:tr>
+      <w:tr>
+        <w:trPr>
+          <w:cantSplit/>
+        </w:trPr>
+        <w:tc>
+          <w:tcPr>
+            <w:tcW w:type="dxa" w:w="3200"/>
+            <w:tcBorders>
+              <w:top w:val="single" w:color="BFC7D3" w:sz="4"/>
+              <w:left w:val="single" w:color="BFC7D3" w:sz="4"/>
+              <w:bottom w:val="single" w:color="BFC7D3" w:sz="4"/>
+              <w:right w:val="single" w:color="BFC7D3" w:sz="4"/>
+            </w:tcBorders>
+            <w:shd w:fill="F3F6FA" w:color="auto" w:val="clear"/>
+            <w:tcMar>
+              <w:top w:type="dxa" w:w="60"/>
+              <w:left w:type="dxa" w:w="100"/>
+              <w:bottom w:type="dxa" w:w="60"/>
+              <w:right w:type="dxa" w:w="100"/>
+            </w:tcMar>
+          </w:tcPr>
+          <w:p>
+            <w:pPr>
+              <w:spacing w:after="0" w:line="265"/>
+            </w:pPr>
+            <w:r>
+              <w:rPr>
+                <w:sz w:val="18"/>
+                <w:szCs w:val="18"/>
+              </w:rPr>
+              <w:t xml:space="preserve">local </w:t>
+            </w:r>
+            <w:r>
+              <w:rPr>
+                <w:rFonts w:ascii="Consolas" w:cs="Consolas" w:eastAsia="Consolas" w:hAnsi="Consolas"/>
+                <w:color w:val="8A2B2B"/>
+                <w:sz w:val="16"/>
+                <w:szCs w:val="16"/>
+              </w:rPr>
+              <w:t xml:space="preserve">inflation_radius</w:t>
+            </w:r>
+          </w:p>
+        </w:tc>
+        <w:tc>
+          <w:tcPr>
+            <w:tcW w:type="dxa" w:w="1300"/>
+            <w:tcBorders>
+              <w:top w:val="single" w:color="BFC7D3" w:sz="4"/>
+              <w:left w:val="single" w:color="BFC7D3" w:sz="4"/>
+              <w:bottom w:val="single" w:color="BFC7D3" w:sz="4"/>
+              <w:right w:val="single" w:color="BFC7D3" w:sz="4"/>
+            </w:tcBorders>
+            <w:tcMar>
+              <w:top w:type="dxa" w:w="60"/>
+              <w:left w:type="dxa" w:w="100"/>
+              <w:bottom w:type="dxa" w:w="60"/>
+              <w:right w:type="dxa" w:w="100"/>
+            </w:tcMar>
+          </w:tcPr>
+          <w:p>
+            <w:pPr>
+              <w:spacing w:after="0" w:line="265"/>
+            </w:pPr>
+            <w:r>
+              <w:rPr>
+                <w:sz w:val="18"/>
+                <w:szCs w:val="18"/>
+              </w:rPr>
+              <w:t xml:space="preserve">0.15 m</w:t>
+            </w:r>
+          </w:p>
+        </w:tc>
+        <w:tc>
+          <w:tcPr>
+            <w:tcW w:type="dxa" w:w="1300"/>
+            <w:tcBorders>
+              <w:top w:val="single" w:color="BFC7D3" w:sz="4"/>
+              <w:left w:val="single" w:color="BFC7D3" w:sz="4"/>
+              <w:bottom w:val="single" w:color="BFC7D3" w:sz="4"/>
+              <w:right w:val="single" w:color="BFC7D3" w:sz="4"/>
+            </w:tcBorders>
+            <w:tcMar>
+              <w:top w:type="dxa" w:w="60"/>
+              <w:left w:type="dxa" w:w="100"/>
+              <w:bottom w:type="dxa" w:w="60"/>
+              <w:right w:type="dxa" w:w="100"/>
+            </w:tcMar>
+          </w:tcPr>
+          <w:p>
+            <w:pPr>
+              <w:spacing w:after="0" w:line="265"/>
+            </w:pPr>
+            <w:r>
+              <w:rPr>
+                <w:sz w:val="18"/>
+                <w:szCs w:val="18"/>
+              </w:rPr>
+              <w:t xml:space="preserve">0.4 m</w:t>
+            </w:r>
+          </w:p>
+        </w:tc>
+        <w:tc>
+          <w:tcPr>
+            <w:tcW w:type="dxa" w:w="3838"/>
+            <w:tcBorders>
+              <w:top w:val="single" w:color="BFC7D3" w:sz="4"/>
+              <w:left w:val="single" w:color="BFC7D3" w:sz="4"/>
+              <w:bottom w:val="single" w:color="BFC7D3" w:sz="4"/>
+              <w:right w:val="single" w:color="BFC7D3" w:sz="4"/>
+            </w:tcBorders>
+            <w:tcMar>
+              <w:top w:type="dxa" w:w="60"/>
+              <w:left w:type="dxa" w:w="100"/>
+              <w:bottom w:type="dxa" w:w="60"/>
+              <w:right w:type="dxa" w:w="100"/>
+            </w:tcMar>
+          </w:tcPr>
+          <w:p>
+            <w:pPr>
+              <w:spacing w:after="0" w:line="265"/>
+            </w:pPr>
+            <w:r>
+              <w:rPr>
+                <w:sz w:val="18"/>
+                <w:szCs w:val="18"/>
+              </w:rPr>
+              <w:t xml:space="preserve">벽 주변 비용 범위 확대</w:t>
+            </w:r>
+          </w:p>
+        </w:tc>
+      </w:tr>
+      <w:tr>
+        <w:trPr>
+          <w:cantSplit/>
+        </w:trPr>
+        <w:tc>
+          <w:tcPr>
+            <w:tcW w:type="dxa" w:w="3200"/>
+            <w:tcBorders>
+              <w:top w:val="single" w:color="BFC7D3" w:sz="4"/>
+              <w:left w:val="single" w:color="BFC7D3" w:sz="4"/>
+              <w:bottom w:val="single" w:color="BFC7D3" w:sz="4"/>
+              <w:right w:val="single" w:color="BFC7D3" w:sz="4"/>
+            </w:tcBorders>
+            <w:shd w:fill="F3F6FA" w:color="auto" w:val="clear"/>
+            <w:tcMar>
+              <w:top w:type="dxa" w:w="60"/>
+              <w:left w:type="dxa" w:w="100"/>
+              <w:bottom w:type="dxa" w:w="60"/>
+              <w:right w:type="dxa" w:w="100"/>
+            </w:tcMar>
+          </w:tcPr>
+          <w:p>
+            <w:pPr>
+              <w:spacing w:after="0" w:line="265"/>
+            </w:pPr>
+            <w:r>
+              <w:rPr>
+                <w:sz w:val="18"/>
+                <w:szCs w:val="18"/>
+              </w:rPr>
+              <w:t xml:space="preserve">global </w:t>
+            </w:r>
+            <w:r>
+              <w:rPr>
+                <w:rFonts w:ascii="Consolas" w:cs="Consolas" w:eastAsia="Consolas" w:hAnsi="Consolas"/>
+                <w:color w:val="8A2B2B"/>
+                <w:sz w:val="16"/>
+                <w:szCs w:val="16"/>
+              </w:rPr>
+              <w:t xml:space="preserve">inflation_radius</w:t>
+            </w:r>
+          </w:p>
+        </w:tc>
+        <w:tc>
+          <w:tcPr>
+            <w:tcW w:type="dxa" w:w="1300"/>
+            <w:tcBorders>
+              <w:top w:val="single" w:color="BFC7D3" w:sz="4"/>
+              <w:left w:val="single" w:color="BFC7D3" w:sz="4"/>
+              <w:bottom w:val="single" w:color="BFC7D3" w:sz="4"/>
+              <w:right w:val="single" w:color="BFC7D3" w:sz="4"/>
+            </w:tcBorders>
+            <w:tcMar>
+              <w:top w:type="dxa" w:w="60"/>
+              <w:left w:type="dxa" w:w="100"/>
+              <w:bottom w:type="dxa" w:w="60"/>
+              <w:right w:type="dxa" w:w="100"/>
+            </w:tcMar>
+          </w:tcPr>
+          <w:p>
+            <w:pPr>
+              <w:spacing w:after="0" w:line="265"/>
+            </w:pPr>
+            <w:r>
+              <w:rPr>
+                <w:sz w:val="18"/>
+                <w:szCs w:val="18"/>
+              </w:rPr>
+              <w:t xml:space="preserve">0.15 m</w:t>
+            </w:r>
+          </w:p>
+        </w:tc>
+        <w:tc>
+          <w:tcPr>
+            <w:tcW w:type="dxa" w:w="1300"/>
+            <w:tcBorders>
+              <w:top w:val="single" w:color="BFC7D3" w:sz="4"/>
+              <w:left w:val="single" w:color="BFC7D3" w:sz="4"/>
+              <w:bottom w:val="single" w:color="BFC7D3" w:sz="4"/>
+              <w:right w:val="single" w:color="BFC7D3" w:sz="4"/>
+            </w:tcBorders>
+            <w:tcMar>
+              <w:top w:type="dxa" w:w="60"/>
+              <w:left w:type="dxa" w:w="100"/>
+              <w:bottom w:type="dxa" w:w="60"/>
+              <w:right w:type="dxa" w:w="100"/>
+            </w:tcMar>
+          </w:tcPr>
+          <w:p>
+            <w:pPr>
+              <w:spacing w:after="0" w:line="265"/>
+            </w:pPr>
+            <w:r>
+              <w:rPr>
+                <w:sz w:val="18"/>
+                <w:szCs w:val="18"/>
+              </w:rPr>
+              <w:t xml:space="preserve">1.0 m</w:t>
+            </w:r>
+          </w:p>
+        </w:tc>
+        <w:tc>
+          <w:tcPr>
+            <w:tcW w:type="dxa" w:w="3838"/>
+            <w:tcBorders>
+              <w:top w:val="single" w:color="BFC7D3" w:sz="4"/>
+              <w:left w:val="single" w:color="BFC7D3" w:sz="4"/>
+              <w:bottom w:val="single" w:color="BFC7D3" w:sz="4"/>
+              <w:right w:val="single" w:color="BFC7D3" w:sz="4"/>
+            </w:tcBorders>
+            <w:tcMar>
+              <w:top w:type="dxa" w:w="60"/>
+              <w:left w:type="dxa" w:w="100"/>
+              <w:bottom w:type="dxa" w:w="60"/>
+              <w:right w:type="dxa" w:w="100"/>
+            </w:tcMar>
+          </w:tcPr>
+          <w:p>
+            <w:pPr>
+              <w:spacing w:after="0" w:line="265"/>
+            </w:pPr>
+            <w:r>
+              <w:rPr>
+                <w:sz w:val="18"/>
+                <w:szCs w:val="18"/>
+              </w:rPr>
+              <w:t xml:space="preserve">전역 경로가 방 가운데로 지나가게</w:t>
+            </w:r>
+          </w:p>
+        </w:tc>
+      </w:tr>
+      <w:tr>
+        <w:trPr>
+          <w:cantSplit/>
+        </w:trPr>
+        <w:tc>
+          <w:tcPr>
+            <w:tcW w:type="dxa" w:w="3200"/>
+            <w:tcBorders>
+              <w:top w:val="single" w:color="BFC7D3" w:sz="4"/>
+              <w:left w:val="single" w:color="BFC7D3" w:sz="4"/>
+              <w:bottom w:val="single" w:color="BFC7D3" w:sz="4"/>
+              <w:right w:val="single" w:color="BFC7D3" w:sz="4"/>
+            </w:tcBorders>
+            <w:shd w:fill="F3F6FA" w:color="auto" w:val="clear"/>
+            <w:tcMar>
+              <w:top w:type="dxa" w:w="60"/>
+              <w:left w:type="dxa" w:w="100"/>
+              <w:bottom w:type="dxa" w:w="60"/>
+              <w:right w:type="dxa" w:w="100"/>
+            </w:tcMar>
+          </w:tcPr>
+          <w:p>
+            <w:pPr>
+              <w:spacing w:after="0" w:line="265"/>
+            </w:pPr>
+            <w:r>
+              <w:rPr>
+                <w:rFonts w:ascii="Consolas" w:cs="Consolas" w:eastAsia="Consolas" w:hAnsi="Consolas"/>
+                <w:color w:val="8A2B2B"/>
+                <w:sz w:val="16"/>
+                <w:szCs w:val="16"/>
+              </w:rPr>
+              <w:t xml:space="preserve">cost_scaling_factor</w:t>
+            </w:r>
+            <w:r>
+              <w:rPr>
+                <w:sz w:val="18"/>
+                <w:szCs w:val="18"/>
+              </w:rPr>
+              <w:t xml:space="preserve"> (local / global)</w:t>
+            </w:r>
+          </w:p>
+        </w:tc>
+        <w:tc>
+          <w:tcPr>
+            <w:tcW w:type="dxa" w:w="1300"/>
+            <w:tcBorders>
+              <w:top w:val="single" w:color="BFC7D3" w:sz="4"/>
+              <w:left w:val="single" w:color="BFC7D3" w:sz="4"/>
+              <w:bottom w:val="single" w:color="BFC7D3" w:sz="4"/>
+              <w:right w:val="single" w:color="BFC7D3" w:sz="4"/>
+            </w:tcBorders>
+            <w:tcMar>
+              <w:top w:type="dxa" w:w="60"/>
+              <w:left w:type="dxa" w:w="100"/>
+              <w:bottom w:type="dxa" w:w="60"/>
+              <w:right w:type="dxa" w:w="100"/>
+            </w:tcMar>
+          </w:tcPr>
+          <w:p>
+            <w:pPr>
+              <w:spacing w:after="0" w:line="265"/>
+            </w:pPr>
+            <w:r>
+              <w:rPr>
+                <w:sz w:val="18"/>
+                <w:szCs w:val="18"/>
+              </w:rPr>
+              <w:t xml:space="preserve">3.0</w:t>
+            </w:r>
+          </w:p>
+        </w:tc>
+        <w:tc>
+          <w:tcPr>
+            <w:tcW w:type="dxa" w:w="1300"/>
+            <w:tcBorders>
+              <w:top w:val="single" w:color="BFC7D3" w:sz="4"/>
+              <w:left w:val="single" w:color="BFC7D3" w:sz="4"/>
+              <w:bottom w:val="single" w:color="BFC7D3" w:sz="4"/>
+              <w:right w:val="single" w:color="BFC7D3" w:sz="4"/>
+            </w:tcBorders>
+            <w:tcMar>
+              <w:top w:type="dxa" w:w="60"/>
+              <w:left w:type="dxa" w:w="100"/>
+              <w:bottom w:type="dxa" w:w="60"/>
+              <w:right w:type="dxa" w:w="100"/>
+            </w:tcMar>
+          </w:tcPr>
+          <w:p>
+            <w:pPr>
+              <w:spacing w:after="0" w:line="265"/>
+            </w:pPr>
+            <w:r>
+              <w:rPr>
+                <w:sz w:val="18"/>
+                <w:szCs w:val="18"/>
+              </w:rPr>
+              <w:t xml:space="preserve">10.0</w:t>
+            </w:r>
+          </w:p>
+        </w:tc>
+        <w:tc>
+          <w:tcPr>
+            <w:tcW w:type="dxa" w:w="3838"/>
+            <w:tcBorders>
+              <w:top w:val="single" w:color="BFC7D3" w:sz="4"/>
+              <w:left w:val="single" w:color="BFC7D3" w:sz="4"/>
+              <w:bottom w:val="single" w:color="BFC7D3" w:sz="4"/>
+              <w:right w:val="single" w:color="BFC7D3" w:sz="4"/>
+            </w:tcBorders>
+            <w:tcMar>
+              <w:top w:type="dxa" w:w="60"/>
+              <w:left w:type="dxa" w:w="100"/>
+              <w:bottom w:type="dxa" w:w="60"/>
+              <w:right w:type="dxa" w:w="100"/>
+            </w:tcMar>
+          </w:tcPr>
+          <w:p>
+            <w:pPr>
+              <w:spacing w:after="0" w:line="265"/>
+            </w:pPr>
+            <w:r>
+              <w:rPr>
+                <w:sz w:val="18"/>
+                <w:szCs w:val="18"/>
+              </w:rPr>
+              <w:t xml:space="preserve">비용이 벽 가까이에서만 급증 → 좁은 통로 통과</w:t>
+            </w:r>
+          </w:p>
+        </w:tc>
+      </w:tr>
+    </w:tbl>
+    <w:p>
+      <w:pPr>
+        <w:pBdr>
+          <w:left w:val="single" w:color="C98A2B" w:sz="18" w:space="8"/>
+        </w:pBdr>
+        <w:shd w:fill="FFF4E6" w:color="auto" w:val="clear"/>
+        <w:spacing w:after="180" w:before="140" w:line="300"/>
+        <w:ind w:left="160" w:right="160"/>
+      </w:pPr>
+      <w:r>
+        <w:rPr>
+          <w:b/>
+          <w:bCs/>
+          <w:color w:val="C98A2B"/>
+        </w:rPr>
+        <w:t xml:space="preserve">대가  </w:t>
+      </w:r>
+      <w:r>
+        <w:t xml:space="preserve">0.01 m 격자에서는 LiDAR 노이즈(±2 cm)가 셀 단위 흔들림으로 보인다. 이것이 4.5절의 좁은 문 false collision으로 이어졌다.</w:t>
+      </w:r>
+    </w:p>
+    <w:p>
+      <w:pPr>
+        <w:pStyle w:val="Heading2"/>
+      </w:pPr>
+      <w:bookmarkStart w:name="_Toc21" w:id="21"/>
+      <w:r>
+        <w:t xml:space="preserve">4.4 교통 정리 파라미터 튜닝</w:t>
+      </w:r>
+      <w:bookmarkEnd w:id="21"/>
     </w:p>
     <w:tbl>
       <w:tblPr>
@@ -11386,11 +12839,11 @@
       <w:pPr>
         <w:pStyle w:val="Heading2"/>
       </w:pPr>
-      <w:bookmarkStart w:name="_Toc21" w:id="21"/>
-      <w:r>
-        <w:t xml:space="preserve">4.4 튜닝 근거가 된 관찰</w:t>
-      </w:r>
-      <w:bookmarkEnd w:id="21"/>
+      <w:bookmarkStart w:name="_Toc22" w:id="22"/>
+      <w:r>
+        <w:t xml:space="preserve">4.5 튜닝 근거가 된 관찰</w:t>
+      </w:r>
+      <w:bookmarkEnd w:id="22"/>
     </w:p>
     <w:p>
       <w:pPr>
@@ -11817,11 +13270,11 @@
         <w:pStyle w:val="Heading1"/>
         <w:pageBreakBefore/>
       </w:pPr>
-      <w:bookmarkStart w:name="_Toc22" w:id="22"/>
+      <w:bookmarkStart w:name="_Toc23" w:id="23"/>
       <w:r>
         <w:t xml:space="preserve">5. 통합·환경 디버깅</w:t>
       </w:r>
-      <w:bookmarkEnd w:id="22"/>
+      <w:bookmarkEnd w:id="23"/>
     </w:p>
     <w:p>
       <w:pPr>
@@ -12413,11 +13866,11 @@
         <w:pStyle w:val="Heading1"/>
         <w:pageBreakBefore/>
       </w:pPr>
-      <w:bookmarkStart w:name="_Toc23" w:id="23"/>
+      <w:bookmarkStart w:name="_Toc24" w:id="24"/>
       <w:r>
         <w:t xml:space="preserve">6. 검증 전략</w:t>
       </w:r>
-      <w:bookmarkEnd w:id="23"/>
+      <w:bookmarkEnd w:id="24"/>
     </w:p>
     <w:tbl>
       <w:tblPr>
@@ -12989,11 +14442,11 @@
         <w:pStyle w:val="Heading1"/>
         <w:pageBreakBefore/>
       </w:pPr>
-      <w:bookmarkStart w:name="_Toc24" w:id="24"/>
+      <w:bookmarkStart w:name="_Toc25" w:id="25"/>
       <w:r>
         <w:t xml:space="preserve">7. 한계와 다음 단계</w:t>
       </w:r>
-      <w:bookmarkEnd w:id="24"/>
+      <w:bookmarkEnd w:id="25"/>
     </w:p>
     <w:tbl>
       <w:tblPr>

</xml_diff>